<commit_message>
docs: eliminate missing unicode glyphs, standardize markdown tables, and regenerate all PDFs and DOCXs
</commit_message>
<xml_diff>
--- a/docs/presentation_script.docx
+++ b/docs/presentation_script.docx
@@ -15,7 +15,7 @@
           <w:color w:val="0F172A"/>
           <w:sz w:val="38"/>
         </w:rPr>
-        <w:t>🎭 CRT LOCK — 2-Speaker Traffic Signal Presentation Script</w:t>
+        <w:t xml:space="preserve"> CRT LOCK — 2-Speaker Traffic Signal Presentation Script</w:t>
       </w:r>
     </w:p>
     <w:p>
@@ -131,7 +131,7 @@
           <w:color w:val="1E3A8A"/>
           <w:sz w:val="27"/>
         </w:rPr>
-        <w:t>🚦 Scene 1: The Problem (Stuck in Traffic)</w:t>
+        <w:t xml:space="preserve"> Scene 1: The Problem (Stuck in Traffic)</w:t>
       </w:r>
     </w:p>
     <w:p>
@@ -327,7 +327,7 @@
           <w:color w:val="1E3A8A"/>
           <w:sz w:val="27"/>
         </w:rPr>
-        <w:t>⚙️ Scene 2: The Traffic Signal Analogy</w:t>
+        <w:t xml:space="preserve"> Scene 2: The Traffic Signal Analogy</w:t>
       </w:r>
     </w:p>
     <w:p>
@@ -649,7 +649,7 @@
           <w:color w:val="1E3A8A"/>
           <w:sz w:val="27"/>
         </w:rPr>
-        <w:t>🎬 Scene 3: Live Interactive Demo</w:t>
+        <w:t xml:space="preserve"> Scene 3: Live Interactive Demo</w:t>
       </w:r>
     </w:p>
     <w:p>
@@ -1341,7 +1341,7 @@
           <w:color w:val="1E3A8A"/>
           <w:sz w:val="27"/>
         </w:rPr>
-        <w:t>🎉 Scene 4: Wrap-Up &amp; Everyday Impact</w:t>
+        <w:t xml:space="preserve"> Scene 4: Wrap-Up &amp; Everyday Impact</w:t>
       </w:r>
     </w:p>
     <w:p>
@@ -1473,7 +1473,7 @@
           <w:color w:val="1E3A8A"/>
           <w:sz w:val="27"/>
         </w:rPr>
-        <w:t>👥 Speaker Role Assignments Summary</w:t>
+        <w:t xml:space="preserve"> Speaker Role Assignments Summary</w:t>
       </w:r>
     </w:p>
     <w:sectPr>

</xml_diff>